<commit_message>
Add group members to README and SRS cover
Co-Authored-By: Claude Opus 5.5 <noreply@anthropic.com>
</commit_message>
<xml_diff>
--- a/docs/SRS_School_Management_Software.docx
+++ b/docs/SRS_School_Management_Software.docx
@@ -78,7 +78,16 @@
           <w:sz w:val="24"/>
           <w:szCs w:val="32"/>
         </w:rPr>
-        <w:t>Prepared by: [Group Name / Number]  -  Members: [Name 1 (Matric No.)], [Name 2], [Name 3], [Name 4]</w:t>
+        <w:t xml:space="preserve">Prepared by: [Group Name / Number]  -  </w:t>
+      </w:r>
+      <w:r>
+        <w:rPr>
+          <w:rFonts w:ascii="Times New Roman" w:eastAsia="Times New Roman" w:hAnsi="Times New Roman" w:cs="Times New Roman"/>
+          <w:bCs/>
+          <w:sz w:val="24"/>
+          <w:szCs w:val="32"/>
+        </w:rPr>
+        <w:t>Members: Samuel Batu, Fred Wosornu, Seth Mensah Quaye, dennisnomo89</w:t>
       </w:r>
     </w:p>
     <w:p>
@@ -566,6 +575,7 @@
           <w:sz w:val="24"/>
           <w:szCs w:val="32"/>
         </w:rPr>
+        <w:lastRenderedPageBreak/>
         <w:t>To study the current manual processes of the school and identify their limitations.</w:t>
       </w:r>
     </w:p>
@@ -1459,6 +1469,7 @@
           <w:sz w:val="24"/>
           <w:szCs w:val="32"/>
         </w:rPr>
+        <w:lastRenderedPageBreak/>
         <w:t>Authentication and authorisation: secure login, password hashing, password reset and role-based access control.</w:t>
       </w:r>
     </w:p>

</xml_diff>